<commit_message>
docs(design): credits PRD charges per attempt, not per theme
Per user feedback: credits are spent per generation attempt (retries
included, re-slice free, failed calls not charged); UI shows a typical
per-theme credit range as guidance with an explicit trial-and-error
caveat; ~5 credit packs TBD, ~USD 4-8 per theme working assumption.

Co-Authored-By: Claude Fable 5.1 <noreply@anthropic.com>
</commit_message>
<xml_diff>
--- a/design-docs/theme-credits-prd.docx
+++ b/design-docs/theme-credits-prd.docx
@@ -28,7 +28,20 @@
     </w:p>
     <w:p>
       <w:r>
-        <w:t xml:space="preserve">Today's theme generation (`src/extension/themeService.ts`, `standalone/src/themeMessages.mjs`) is bring-your-own-key: the user pastes an OpenAI (or Google Gemini) API key into the Theme Generator dialog (`media/main.js:3090-3219`, "OpenAI API key" / "Google Gemini API key" field, stored via a `SAVE_API_KEY`-style message and `updateThemeApiKeyUi`), and every image call (`createReviewItems` boards, `retryThemeImage`, `resliceThemeImageFromRaw`) bills that key directly. This works but has real costs to the product: users must obtain and manage their own key, get billed by OpenAI/Google directly with no markup or support surface for Corsair, and the extension has no monetization path of its own. The product decision (2026-09-03) is to move theme generation to a Corsair-hosted, authenticated API — the "Corsair Theme Service" — so users buy credit packs through Corsair's own Stripe account and spend credits per board/theme, while uploading or hand-making themes stays free and fully offline (no service dependency at all).</w:t>
+        <w:t xml:space="preserve">Today's theme generation (`src/extension/themeService.ts`, `standalone/src/themeMessages.mjs`) is bring-your-own-key: the user pastes an OpenAI (or Google Gemini) API key into the Theme Generator dialog (`media/main.js:3090-3219`, "OpenAI API key" / "Google Gemini API key" field, stored via a `SAVE_API_KEY`-style message and `updateThemeApiKeyUi`), and every image call (`createReviewItems` boards, `retryThemeImage`, `resliceThemeImageFromRaw`) bills that key directly. This works but has real costs to the product: users must obtain and manage their own key, get billed by OpenAI/Google directly with no markup or support surface for Corsair, and the extension has no monetization path of its own. The product decision (2026-09-03) is to move theme generation to a Corsair-hosted, authenticated API — the "Corsair Theme Service" — so users buy credit packs through Corsair's own Stripe account, while uploading or hand-making themes stays free and fully offline (no service dependency at all).</w:t>
+      </w:r>
+    </w:p>
+    <w:p>
+      <w:r/>
+      <w:r>
+        <w:rPr>
+          <w:b/>
+          <w:bCs/>
+        </w:rPr>
+        <w:t xml:space="preserve">We sell credits, not themes.</w:t>
+      </w:r>
+      <w:r>
+        <w:t xml:space="preserve"> Every generation attempt that actually calls the image model spends credits — the initial attempt on a board and every retry on that board are each a billable attempt, because each one is a real model call. Re-slicing an existing generation from its raw atlas (`resliceThemeImageFromRaw`) makes no model call and is always free. A theme's total cost is simply the sum of whatever attempts the user made across its boards — some boards succeed first try, some take five — so Corsair does not know a theme's price in advance and never charges a flat per-theme amount.</w:t>
       </w:r>
     </w:p>
     <w:p>
@@ -124,19 +137,31 @@
         </w:numPr>
       </w:pPr>
       <w:r>
-        <w:t xml:space="preserve">A user can generate a full theme (all boards) without ever holding a model API key, by spending credits from a Corsair account balance.</w:t>
-      </w:r>
-    </w:p>
-    <w:p>
-      <w:pPr>
-        <w:pStyle w:val="ListParagraph"/>
-        <w:numPr>
-          <w:ilvl w:val="0"/>
-          <w:numId w:val="1"/>
-        </w:numPr>
-      </w:pPr>
-      <w:r>
-        <w:t xml:space="preserve">Per-board and per-theme credit cost is shown as an estimate before generation starts, and a failed board automatically refunds its credit.</w:t>
+        <w:t xml:space="preserve">A user can generate a full theme (all boards) without ever holding a model API key, by spending credits from a Corsair account balance, one credit charge per generation attempt (initial + each retry).</w:t>
+      </w:r>
+    </w:p>
+    <w:p>
+      <w:pPr>
+        <w:pStyle w:val="ListParagraph"/>
+        <w:numPr>
+          <w:ilvl w:val="0"/>
+          <w:numId w:val="1"/>
+        </w:numPr>
+      </w:pPr>
+      <w:r>
+        <w:t xml:space="preserve">Before each generation attempt, the dialog shows "this attempt costs N credits" and a running total spent on the current theme; the UI also shows a "typical theme" guidance range (e.g. "a theme typically takes between X and Y credits") derived from observed attempt counts, not a quote or guarantee.</w:t>
+      </w:r>
+    </w:p>
+    <w:p>
+      <w:pPr>
+        <w:pStyle w:val="ListParagraph"/>
+        <w:numPr>
+          <w:ilvl w:val="0"/>
+          <w:numId w:val="1"/>
+        </w:numPr>
+      </w:pPr>
+      <w:r>
+        <w:t xml:space="preserve">A failed API call (provider error, no image returned) automatically refunds its credit; an attempt that returns an image the user simply doesn't like is not refunded — it was a real model call.</w:t>
       </w:r>
     </w:p>
     <w:p>
@@ -232,19 +257,19 @@
         </w:numPr>
       </w:pPr>
       <w:r>
-        <w:t xml:space="preserve">Per-board credit pricing with a pre-generation estimate — planned, extends existing `createReviewItems` board enumeration.</w:t>
-      </w:r>
-    </w:p>
-    <w:p>
-      <w:pPr>
-        <w:pStyle w:val="ListParagraph"/>
-        <w:numPr>
-          <w:ilvl w:val="0"/>
-          <w:numId w:val="1"/>
-        </w:numPr>
-      </w:pPr>
-      <w:r>
-        <w:t xml:space="preserve">Automatic refund on a failed board — planned, hooks into the existing per-board retry/error path (`retryThemeImage`, `onProgress` failure branches in `themeService.ts`).</w:t>
+        <w:t xml:space="preserve">Per-attempt credit pricing per board type, plus a UI-shown "typical theme" guidance range — planned, extends existing `createReviewItems` board enumeration.</w:t>
+      </w:r>
+    </w:p>
+    <w:p>
+      <w:pPr>
+        <w:pStyle w:val="ListParagraph"/>
+        <w:numPr>
+          <w:ilvl w:val="0"/>
+          <w:numId w:val="1"/>
+        </w:numPr>
+      </w:pPr>
+      <w:r>
+        <w:t xml:space="preserve">Automatic refund on a failed API call (not on an unsatisfying image) — planned, hooks into the existing per-board retry/error path (`retryThemeImage`, `onProgress` failure branches in `themeService.ts`).</w:t>
       </w:r>
     </w:p>
     <w:p>
@@ -337,7 +362,7 @@
         <w:t xml:space="preserve">Generate a theme</w:t>
       </w:r>
       <w:r>
-        <w:t xml:space="preserve">: client requests a per-board cost estimate from the service using the current plan's board list (same enumeration `createReviewItems` already produces — see Grounding below) → shows total estimated credits → user confirms → each board's generation request goes through the service (prompt + reference images in, sprite sheet out) → the service debits credits per successful board and refunds automatically on a failed/errored board, mirroring today's per-board retry granularity in `retryThemeImage`. 4. </w:t>
+        <w:t xml:space="preserve">: client shows the per-attempt credit cost for the board about to be generated ("this attempt costs N credits") plus the running total spent on this theme so far, and a "typical theme" guidance range for context → user confirms → the generation request goes through the service (prompt + reference images in, sprite sheet out) → the service debits one credit for that attempt on a successful or unsatisfying-but-returned image, and refunds automatically only if the API call itself failed (provider error, no image returned) → a retry on the same board is a new attempt at the same per-attempt price; a re-slice from raw is free (no model call). 4. </w:t>
       </w:r>
       <w:r>
         <w:rPr>
@@ -452,17 +477,37 @@
           <w:b/>
           <w:bCs/>
         </w:rPr>
-        <w:t xml:space="preserve">Per-board pricing + estimate + refund</w:t>
-      </w:r>
-    </w:p>
-    <w:p>
-      <w:r>
-        <w:t xml:space="preserve">Price per board (not per theme), since board count varies with the plan's roster size (agent boards, rivals-group boards, `objects_01`/`objects_02`, `environment`, `expressions`, `achievements` — see Grounding). The client requests/derives an estimate from the current plan's board list before confirming generation, matching the same board enumeration `createReviewItems` already produces so the estimate and the actual per-board billing can never drift from what will actually be generated. A board that errors (safety block, provider failure, network failure) refunds its credit automatically, server-side, on the same request that reports the failure — never a manual/support-ticket refund for the ordinary failure case.</w:t>
-      </w:r>
-    </w:p>
-    <w:p>
-      <w:r>
-        <w:t xml:space="preserve">Board count per theme is deterministic from the plan: one board per roster agent, plus the rival-group boards, plus five fixed boards (objects_01, objects_02, environment, expressions, achievements), as enumerated by createReviewItems in src/extension/themeService.ts. The pre-generation estimate multiplies this count by the per-board credit price; re-slicing from raw makes no provider call and is never billed.</w:t>
+        <w:t xml:space="preserve">Per-attempt pricing + guidance range + refund</w:t>
+      </w:r>
+    </w:p>
+    <w:p>
+      <w:r>
+        <w:t xml:space="preserve">Price is per generation attempt on a board (not per board and not per theme): each call to the image model — the initial attempt and every retry — is a separate, equally-billed attempt, because each is a real model call. A board that errors before returning an image (safety block, provider failure, network failure) refunds its credit automatically, server-side, on the same request that reports the failure — never a manual/support-ticket refund for the ordinary failure case. An attempt that returns an image the user doesn't like is not a failure and is not refunded.</w:t>
+      </w:r>
+    </w:p>
+    <w:p>
+      <w:r>
+        <w:t xml:space="preserve">Board count per theme is still deterministic from the plan: one board per roster agent, plus the rival-group boards, plus five fixed boards (objects_01, objects_02, environment, expressions, achievements), as enumerated by `createReviewItems` in `src/extension/themeService.ts`. That deterministic count is the basis for the </w:t>
+      </w:r>
+      <w:r>
+        <w:rPr>
+          <w:b/>
+          <w:bCs/>
+        </w:rPr>
+        <w:t xml:space="preserve">lower bound</w:t>
+      </w:r>
+      <w:r>
+        <w:t xml:space="preserve"> of the "typical theme" guidance range shown in the UI (one attempt per board, no retries); the </w:t>
+      </w:r>
+      <w:r>
+        <w:rPr>
+          <w:b/>
+          <w:bCs/>
+        </w:rPr>
+        <w:t xml:space="preserve">upper bound</w:t>
+      </w:r>
+      <w:r>
+        <w:t xml:space="preserve"> comes from observed retry behavior once real usage data exists (M0/M1). The dialog shows this range as guidance ("a theme typically takes between X and Y credits"), never as a quote or a guarantee — it cannot know in advance how many retries a given theme will need. Re-slicing from raw makes no provider call and is never billed.</w:t>
       </w:r>
     </w:p>
     <w:p>
@@ -474,6 +519,23 @@
           <w:b/>
           <w:bCs/>
         </w:rPr>
+        <w:t xml:space="preserve">Generation quality caveat (product + in-app disclosure)</w:t>
+      </w:r>
+    </w:p>
+    <w:p>
+      <w:r>
+        <w:t xml:space="preserve">Generation runs through a third-party AI image model and its output quality depends heavily on the user's own prompts. TycoonAgents' built-in prompt scaffolding (existing prompt-construction code in `themeService.ts`) helps structure a request but cannot know what a specific board should look like for a specific user's theme — it cannot describe the user's intent for them. Users should expect trial and error, especially on their first theme, and should expect credits to be consumed by retries as they converge on an acceptable result. There is no guarantee of a "perfect" or even satisfactory result on any given attempt. The in-product disclosure (see § Privacy/terms text changes) must state this plainly before the user's first purchase or generation: generation attempts are billed per call including retries; only calls that fail outright (provider error, no image returned) are refunded; an unsatisfying-but-returned image is not refunded.</w:t>
+      </w:r>
+    </w:p>
+    <w:p>
+      <w:pPr>
+        <w:pStyle w:val="Heading3"/>
+      </w:pPr>
+      <w:r>
+        <w:rPr>
+          <w:b/>
+          <w:bCs/>
+        </w:rPr>
         <w:t xml:space="preserve">Rate limits / abuse controls</w:t>
       </w:r>
     </w:p>
@@ -496,7 +558,7 @@
     </w:p>
     <w:p>
       <w:r>
-        <w:t xml:space="preserve">The client's existing disclosure pattern (`media/main.js:16288-16330`, "what's never sent" / "local file paths and API keys are redacted") must be updated: prompts and now-generated images transit Corsair's server, not the user's own OpenAI/Gemini account, and the "your API keys ... are removed" language needs a companion line stating that theme prompts/images ARE sent to the Corsair Theme Service when generating (not when uploading/hand-making). Terms text needs a credits/refunds/no-guarantee-of-image-quality clause. </w:t>
+        <w:t xml:space="preserve">The client's existing disclosure pattern (`media/main.js:16288-16330`, "what's never sent" / "local file paths and API keys are redacted") must be updated: prompts and now-generated images transit Corsair's server, not the user's own OpenAI/Gemini account, and the "your API keys ... are removed" language needs a companion line stating that theme prompts/images ARE sent to the Corsair Theme Service when generating (not when uploading/hand-making). Terms text needs a credits/refunds/no-guarantee-of-image-quality clause covering: credits are spent per generation attempt including retries; re-slicing from raw is free; only outright-failed calls are refunded; results depend on the user's own prompts and are not guaranteed. </w:t>
       </w:r>
       <w:r>
         <w:rPr>
@@ -540,7 +602,7 @@
     </w:p>
     <w:p>
       <w:r>
-        <w:t xml:space="preserve">Balance shown wherever the API-key field used to live in the dialog; "Buy credits" opens the browser to Checkout and the client polls balance on an interval (and once more when the webview regains focus) until the purchase lands or the user cancels.</w:t>
+        <w:t xml:space="preserve">Balance shown wherever the API-key field used to live in the dialog, alongside a "typical theme costs X-Y credits" guidance line; "Buy credits" opens the browser to Checkout (offering roughly five credit-pack SKUs, sizes/prices TBD — see Tech Stack and Open Questions) and the client polls balance on an interval (and once more when the webview regains focus) until the purchase lands or the user cancels. Before each attempt, the dialog shows "this attempt costs N credits" and the running total spent on the current theme so far.</w:t>
       </w:r>
     </w:p>
     <w:p>
@@ -680,7 +742,7 @@
         </w:numPr>
       </w:pPr>
       <w:r>
-        <w:t xml:space="preserve">Payments: Stripe Checkout + webhooks + Stripe Tax, under Corsair's existing Stripe account.</w:t>
+        <w:t xml:space="preserve">Payments: Stripe Checkout + webhooks + Stripe Tax, under Corsair's existing Stripe account; roughly five credit-pack SKUs, sizes and prices TBD by the user. Working assumption (not a fact, to be validated with real spend data in M0/M1): a typical theme lands around USD 4-8 depending on retry count.</w:t>
       </w:r>
     </w:p>
     <w:p>
@@ -788,10 +850,10 @@
           <w:b/>
           <w:bCs/>
         </w:rPr>
-        <w:t xml:space="preserve">Pricing tiers</w:t>
-      </w:r>
-      <w:r>
-        <w:t xml:space="preserve"> — not set here; needs a per-board cost floor from the service's actual OpenAI/Gemini spend plus margin, decided when M0/M1 are built and real image-call costs are known.</w:t>
+        <w:t xml:space="preserve">Credit-pack pricing</w:t>
+      </w:r>
+      <w:r>
+        <w:t xml:space="preserve"> — sizes/prices of the roughly five packs are TBD by the user; the USD 4-8 typical-theme figure is a working assumption pending real M0/M1 spend data, not a committed price point.</w:t>
       </w:r>
     </w:p>
     <w:p>
@@ -811,7 +873,7 @@
         <w:t xml:space="preserve">Refunds policy (cash refunds on unused credit balances)</w:t>
       </w:r>
       <w:r>
-        <w:t xml:space="preserve"> — unresolved; distinct from the automatic per-board-failure refund (in scope, § Requirements) which is not a policy question but a correctness requirement.</w:t>
+        <w:t xml:space="preserve"> — unresolved; distinct from the automatic per-failed-call refund (in scope, § Requirements) which is not a policy question but a correctness requirement.</w:t>
       </w:r>
     </w:p>
     <w:p>
@@ -848,10 +910,30 @@
           <w:b/>
           <w:bCs/>
         </w:rPr>
-        <w:t xml:space="preserve">Margin risk on retries</w:t>
-      </w:r>
-      <w:r>
-        <w:t xml:space="preserve"> — a retried/re-sliced board (`retryThemeImage`) either needs its own credit charge or a defined "free retry within N minutes" policy; unresolved here, must be decided before M1's pricing model is finalized.</w:t>
+        <w:t xml:space="preserve">Heavy retriers</w:t>
+      </w:r>
+      <w:r>
+        <w:t xml:space="preserve"> — since every retry is a billed attempt, a user who struggles to get a satisfying result on a board can burn through credits quickly and unhappily; this is priced correctly (each attempt is a real model call) but is a real support-burden and satisfaction risk. Mitigation: the "typical theme" guidance range sets expectations up front, and the caveat text (§ Generation quality caveat) is explicit that trial and error is expected.</w:t>
+      </w:r>
+    </w:p>
+    <w:p>
+      <w:pPr>
+        <w:pStyle w:val="ListParagraph"/>
+        <w:numPr>
+          <w:ilvl w:val="0"/>
+          <w:numId w:val="1"/>
+        </w:numPr>
+      </w:pPr>
+      <w:r/>
+      <w:r>
+        <w:rPr>
+          <w:b/>
+          <w:bCs/>
+        </w:rPr>
+        <w:t xml:space="preserve">Prompt-quality support burden</w:t>
+      </w:r>
+      <w:r>
+        <w:t xml:space="preserve"> — users unfamiliar with prompting an image model will likely file more support tickets and burn more credits than experienced users. Mitigation: add a "prompt tips" link from the generator dialog to guidance on writing effective board prompts, to reduce avoidable retries without claiming the scaffolding can write the prompt for them.</w:t>
       </w:r>
     </w:p>
     <w:p>
@@ -1051,7 +1133,7 @@
         </w:numPr>
       </w:pPr>
       <w:r>
-        <w:t xml:space="preserve">A stub generation call against one board type debits exactly one credit and returns an image, or fails and refunds with no net balance change.</w:t>
+        <w:t xml:space="preserve">A stub generation call against one board type debits exactly one credit for that attempt and returns an image, or fails (no image returned) and refunds with no net balance change; a second attempt (retry) on the same board debits a second credit.</w:t>
       </w:r>
     </w:p>
     <w:p>
@@ -1148,7 +1230,7 @@
         </w:numPr>
       </w:pPr>
       <w:r>
-        <w:t xml:space="preserve">At least two credit-pack SKUs defined (exact pricing per the Open Questions item above — placeholder values acceptable at this milestone).</w:t>
+        <w:t xml:space="preserve">Roughly five credit-pack SKUs defined (exact sizes/pricing TBD per the Open Questions item above — placeholder values acceptable at this milestone).</w:t>
       </w:r>
     </w:p>
     <w:p>
@@ -1293,7 +1375,19 @@
         </w:numPr>
       </w:pPr>
       <w:r>
-        <w:t xml:space="preserve">Client-side estimate call before generation, built from the same board list `createReviewItems` (`src/extension/themeService.ts:3149`) already enumerates.</w:t>
+        <w:t xml:space="preserve">Client-side "this attempt costs N credits" + running-total-spent display before/during generation, plus a "typical theme" guidance range derived from the deterministic board count (`createReviewItems`, `src/extension/themeService.ts:3149`) as its lower bound.</w:t>
+      </w:r>
+    </w:p>
+    <w:p>
+      <w:pPr>
+        <w:pStyle w:val="ListParagraph"/>
+        <w:numPr>
+          <w:ilvl w:val="0"/>
+          <w:numId w:val="1"/>
+        </w:numPr>
+      </w:pPr>
+      <w:r>
+        <w:t xml:space="preserve">A "prompt tips" link in the generator dialog, per the prompt-quality support-burden mitigation (§ Risks).</w:t>
       </w:r>
     </w:p>
     <w:p>
@@ -1386,19 +1480,19 @@
         </w:numPr>
       </w:pPr>
       <w:r>
-        <w:t xml:space="preserve">The estimate shown before generation matches the number of boards actually billed, verified against a fixed test plan.</w:t>
-      </w:r>
-    </w:p>
-    <w:p>
-      <w:pPr>
-        <w:pStyle w:val="ListParagraph"/>
-        <w:numPr>
-          <w:ilvl w:val="0"/>
-          <w:numId w:val="1"/>
-        </w:numPr>
-      </w:pPr>
-      <w:r>
-        <w:t xml:space="preserve">A forced board failure (e.g. simulated network error to the service) results in a refund visible in the balance display without a page reload.</w:t>
+        <w:t xml:space="preserve">The per-attempt cost shown before each generation matches what is actually billed for that attempt, and the running total displayed matches the ledger's sum of attempts for that theme so far, verified against a fixed test plan including at least one retry.</w:t>
+      </w:r>
+    </w:p>
+    <w:p>
+      <w:pPr>
+        <w:pStyle w:val="ListParagraph"/>
+        <w:numPr>
+          <w:ilvl w:val="0"/>
+          <w:numId w:val="1"/>
+        </w:numPr>
+      </w:pPr>
+      <w:r>
+        <w:t xml:space="preserve">A forced board failure (e.g. simulated network error to the service) results in a refund visible in the balance display without a page reload; a forced "unsatisfying but returned" result (a successful call the test treats as a retry trigger) does not refund.</w:t>
       </w:r>
     </w:p>
     <w:p>

</xml_diff>